<commit_message>
fix(copy): describe Hatch accurately and drop deployment-pipeline claims
Hatch is an automated application processing platform for lenders (IDV,
KYC, KYB, IBV, background checks), not a loan management system. AWS
deployments are handled by a dedicated DevOps engineer, so the 'own the
deployment pipeline' bullet, the deploy-button wording and the Azure
DevOps mention at Hatch are removed from the site, resume and letter.
Edge headless now gets an explicit profile dir in resume/build.sh.

Co-Authored-By: Claude Fable 5.1 <noreply@anthropic.com>
</commit_message>
<xml_diff>
--- a/resume/Mint_Nguyen_Cover_Letter.docx
+++ b/resume/Mint_Nguyen_Cover_Letter.docx
@@ -128,7 +128,7 @@
           <w:sz w:val="22"/>
           <w:szCs w:val="22"/>
         </w:rPr>
-        <w:t xml:space="preserve">I'm a full stack engineer who likes being there from the first commit. At Hatch I built a loan management platform for lenders from an empty repo, and as the team grew to 7+ engineers I became the person everyone pings about the codebase. I'd love to bring that same energy to the [Role] role at [Company], [one sentence on why this company].</w:t>
+        <w:t xml:space="preserve">I'm a full stack engineer who likes being there from the first commit. At Hatch I built an automated application processing platform for lenders from an empty repo, and as the team grew to 7+ engineers I became the person everyone pings about the codebase. I'd love to bring that same energy to the [Role] role at [Company], [one sentence on why this company].</w:t>
       </w:r>
     </w:p>
     <w:p>
@@ -142,7 +142,7 @@
           <w:sz w:val="22"/>
           <w:szCs w:val="22"/>
         </w:rPr>
-        <w:t xml:space="preserve">Building Hatch's platform meant owning the whole path: gathering requirements with the founders, wireframing in Figma, shipping the APIs and front ends, automating decisioning and disbursements, and running the pipeline that takes a change from laptop to production. Just as important, it meant keeping a growing team unblocked with small PRs, honest code review, and a map of the codebase that every new engineer gets in their first week.</w:t>
+        <w:t xml:space="preserve">Building Hatch's platform meant owning the whole path: gathering requirements with the founders, wireframing in Figma, shipping the APIs and front ends, and wiring identity verification, KYC, KYB, bank verification and background checks into one automated flow. Just as important, it meant keeping a growing team unblocked with small PRs, honest code review, and a map of the codebase that every new engineer gets in their first week.</w:t>
       </w:r>
     </w:p>
     <w:p>

</xml_diff>